<commit_message>
Migrar a Supabase e infraestructura propia
</commit_message>
<xml_diff>
--- a/IMPORTANTE BALANCE PLUS.docx
+++ b/IMPORTANTE BALANCE PLUS.docx
@@ -12,7 +12,65 @@
         <w:rPr>
           <w:lang w:val="es-ES_tradnl"/>
         </w:rPr>
-        <w:t>VALIDACIÓN FINAL DE CONSISTENCIA Y DATOS.</w:t>
+        <w:t>CORREGIR MEDICAMENTOS</w:t>
+      </w:r>
+    </w:p>
+    <w:p>
+      <w:pPr>
+        <w:rPr>
+          <w:lang w:val="es-ES_tradnl"/>
+        </w:rPr>
+      </w:pPr>
+      <w:r>
+        <w:rPr>
+          <w:lang w:val="es-ES_tradnl"/>
+        </w:rPr>
+        <w:t>INTEGRACION API GOOGLE MAPS</w:t>
+      </w:r>
+    </w:p>
+    <w:p>
+      <w:pPr>
+        <w:rPr>
+          <w:lang w:val="es-ES_tradnl"/>
+        </w:rPr>
+      </w:pPr>
+      <w:r>
+        <w:rPr>
+          <w:lang w:val="es-ES_tradnl"/>
+        </w:rPr>
+        <w:t>INTEGRAR REDES SOCIALES</w:t>
+      </w:r>
+    </w:p>
+    <w:p>
+      <w:pPr>
+        <w:rPr>
+          <w:lang w:val="es-ES_tradnl"/>
+        </w:rPr>
+      </w:pPr>
+      <w:r>
+        <w:rPr>
+          <w:lang w:val="es-ES_tradnl"/>
+        </w:rPr>
+        <w:t>INTEGRAR LOGIN SOCIAL</w:t>
+      </w:r>
+      <w:r>
+        <w:rPr>
+          <w:lang w:val="es-ES_tradnl"/>
+        </w:rPr>
+        <w:t xml:space="preserve"> – GOOGLE OK, APPLE PENDIENTE 99 DOLARES</w:t>
+      </w:r>
+    </w:p>
+    <w:p>
+      <w:pPr>
+        <w:rPr>
+          <w:lang w:val="es-ES_tradnl"/>
+        </w:rPr>
+      </w:pPr>
+      <w:r>
+        <w:rPr>
+          <w:lang w:val="es-ES_tradnl"/>
+        </w:rPr>
+        <w:t>ACTUALIZAR PLAN DE SUPABASE</w:t>
       </w:r>
     </w:p>
     <w:p>
@@ -35,12 +93,6 @@
           <w:lang w:val="es-ES_tradnl"/>
         </w:rPr>
       </w:pPr>
-      <w:r>
-        <w:rPr>
-          <w:lang w:val="es-ES_tradnl"/>
-        </w:rPr>
-        <w:t>CORREGIR MEDICAMENTOS</w:t>
-      </w:r>
     </w:p>
     <w:p>
       <w:pPr>
@@ -52,7 +104,25 @@
         <w:rPr>
           <w:lang w:val="es-ES_tradnl"/>
         </w:rPr>
-        <w:t>INTEGRACION API GOOGLE MAPS</w:t>
+        <w:br/>
+      </w:r>
+      <w:r>
+        <w:rPr>
+          <w:lang w:val="es-ES_tradnl"/>
+        </w:rPr>
+        <w:t xml:space="preserve">CONTRASEÑA </w:t>
+      </w:r>
+      <w:r>
+        <w:rPr>
+          <w:lang w:val="es-ES_tradnl"/>
+        </w:rPr>
+        <w:t>BASE DE DATOS</w:t>
+      </w:r>
+      <w:r>
+        <w:rPr>
+          <w:lang w:val="es-ES_tradnl"/>
+        </w:rPr>
+        <w:t xml:space="preserve"> SUPABASE</w:t>
       </w:r>
     </w:p>
     <w:p>
@@ -61,64 +131,38 @@
           <w:lang w:val="es-ES_tradnl"/>
         </w:rPr>
       </w:pPr>
-      <w:r>
-        <w:rPr>
-          <w:lang w:val="es-ES_tradnl"/>
-        </w:rPr>
-        <w:t>INTEGRAR REDES SOCIALES</w:t>
-      </w:r>
-    </w:p>
-    <w:p>
-      <w:pPr>
-        <w:rPr>
-          <w:lang w:val="es-ES_tradnl"/>
-        </w:rPr>
-      </w:pPr>
-      <w:r>
-        <w:rPr>
-          <w:lang w:val="es-ES_tradnl"/>
-        </w:rPr>
-        <w:t>INTEGRAR LOGIN SOCIAL</w:t>
-      </w:r>
-    </w:p>
-    <w:p>
-      <w:pPr>
-        <w:rPr>
-          <w:lang w:val="es-ES_tradnl"/>
-        </w:rPr>
-      </w:pPr>
-      <w:r>
-        <w:rPr>
-          <w:lang w:val="es-ES_tradnl"/>
-        </w:rPr>
-        <w:t>ACTUALIZAR PLAN DE SUPABASE</w:t>
-      </w:r>
-    </w:p>
-    <w:p>
-      <w:pPr>
-        <w:rPr>
-          <w:lang w:val="es-ES_tradnl"/>
-        </w:rPr>
-      </w:pPr>
+      <w:proofErr w:type="spellStart"/>
+      <w:r>
+        <w:rPr>
+          <w:lang w:val="es-ES_tradnl"/>
+        </w:rPr>
+        <w:t>jgeIAPitYoXKPFiJ</w:t>
+      </w:r>
+      <w:proofErr w:type="spellEnd"/>
       <w:r>
         <w:rPr>
           <w:lang w:val="es-ES_tradnl"/>
         </w:rPr>
         <w:br/>
       </w:r>
-      <w:proofErr w:type="spellStart"/>
-      <w:r>
-        <w:rPr>
-          <w:lang w:val="es-ES_tradnl"/>
-        </w:rPr>
-        <w:t>jgeIAPitYoXKPFiJ</w:t>
-      </w:r>
-      <w:proofErr w:type="spellEnd"/>
-      <w:r>
-        <w:rPr>
-          <w:lang w:val="es-ES_tradnl"/>
-        </w:rPr>
-        <w:t xml:space="preserve"> BASE DE DATOS</w:t>
+      <w:r>
+        <w:rPr>
+          <w:lang w:val="es-ES_tradnl"/>
+        </w:rPr>
+        <w:br/>
+        <w:t>ID CLIENTE GOOGLE AUTH</w:t>
+      </w:r>
+      <w:r>
+        <w:rPr>
+          <w:lang w:val="es-ES_tradnl"/>
+        </w:rPr>
+        <w:br/>
+      </w:r>
+      <w:r>
+        <w:rPr>
+          <w:lang w:val="es-ES_tradnl"/>
+        </w:rPr>
+        <w:t>450289027334-1e40rgvv54oqqaaboe3avablpq6cnp9n.apps.googleusercontent.com</w:t>
       </w:r>
     </w:p>
     <w:p>

</xml_diff>